<commit_message>
Add copyright and trademark marking per counsel standard
- Nav lockup: Liberty CTI(TM) wordmark and a small (c) at the emblem; the
  Strategic Cyber Intelligence tagline now stays visible at all widths
- Global footer: (c) 2026 Liberty CTI LLC. All rights reserved.
- Copyright meta tag injected into every managed page by sync_components
- Rebuilt ATB Word/PDF archive companions after the sitewide HTML change
- CLAUDE.md: standing copyright/trademark marking rule (no (R) until
  registration issues)

Co-Authored-By: Claude Opus 5.5 <noreply@anthropic.com>
</commit_message>
<xml_diff>
--- a/ATB Archive/2026/ATB-2026-01/ATB-2026-1_2026-03-16_Elevated_Iran-linked_Retaliation_Activity_Ongoing_Across_All_Sectors.docx
+++ b/ATB Archive/2026/ATB-2026-01/ATB-2026-1_2026-03-16_Elevated_Iran-linked_Retaliation_Activity_Ongoing_Across_All_Sectors.docx
@@ -1093,6 +1093,36 @@
     </w:p>
     <w:p>
       <w:pPr>
+        <w:spacing w:after="160"/>
+      </w:pPr>
+      <w:r>
+        <w:rPr>
+          <w:rFonts w:ascii="Georgia" w:hAnsi="Georgia"/>
+          <w:b w:val="0"/>
+          <w:i w:val="0"/>
+          <w:color w:val="142233"/>
+          <w:sz w:val="21"/>
+        </w:rPr>
+        <w:t>Test what this means for your organization.</w:t>
+      </w:r>
+    </w:p>
+    <w:p>
+      <w:pPr>
+        <w:spacing w:after="160"/>
+      </w:pPr>
+      <w:r>
+        <w:rPr>
+          <w:rFonts w:ascii="Georgia" w:hAnsi="Georgia"/>
+          <w:b w:val="0"/>
+          <w:i w:val="0"/>
+          <w:color w:val="142233"/>
+          <w:sz w:val="21"/>
+        </w:rPr>
+        <w:t>EXECUTIVE INTELLIGENCE BASELINE + EXECUTIVE DECISION EXERCISE →</w:t>
+      </w:r>
+    </w:p>
+    <w:p>
+      <w:pPr>
         <w:spacing w:before="360"/>
         <w:jc w:val="center"/>
       </w:pPr>

</xml_diff>